<commit_message>
feat: implement analysis suite with multi-log comparison tools and associated UI assets
</commit_message>
<xml_diff>
--- a/Documentation/Bytehound_User_Manual.docx
+++ b/Documentation/Bytehound_User_Manual.docx
@@ -958,7 +958,7 @@
       <w:r>
         <w:drawing>
           <wp:inline xmlns:a="http://schemas.openxmlformats.org/drawingml/2006/main" xmlns:pic="http://schemas.openxmlformats.org/drawingml/2006/picture">
-            <wp:extent cx="5040000" cy="3150000"/>
+            <wp:extent cx="5040000" cy="4774737"/>
             <wp:docPr id="1" name="Picture 1"/>
             <wp:cNvGraphicFramePr>
               <a:graphicFrameLocks noChangeAspect="1"/>
@@ -979,7 +979,7 @@
                   <pic:spPr>
                     <a:xfrm>
                       <a:off x="0" y="0"/>
-                      <a:ext cx="5040000" cy="3150000"/>
+                      <a:ext cx="5040000" cy="4774737"/>
                     </a:xfrm>
                     <a:prstGeom prst="rect"/>
                   </pic:spPr>
@@ -1140,7 +1140,7 @@
       <w:r>
         <w:drawing>
           <wp:inline xmlns:a="http://schemas.openxmlformats.org/drawingml/2006/main" xmlns:pic="http://schemas.openxmlformats.org/drawingml/2006/picture">
-            <wp:extent cx="5040000" cy="1351875"/>
+            <wp:extent cx="5040000" cy="900000"/>
             <wp:docPr id="2" name="Picture 2"/>
             <wp:cNvGraphicFramePr>
               <a:graphicFrameLocks noChangeAspect="1"/>
@@ -1161,7 +1161,7 @@
                   <pic:spPr>
                     <a:xfrm>
                       <a:off x="0" y="0"/>
-                      <a:ext cx="5040000" cy="1351875"/>
+                      <a:ext cx="5040000" cy="900000"/>
                     </a:xfrm>
                     <a:prstGeom prst="rect"/>
                   </pic:spPr>
@@ -1921,7 +1921,7 @@
       <w:r>
         <w:drawing>
           <wp:inline xmlns:a="http://schemas.openxmlformats.org/drawingml/2006/main" xmlns:pic="http://schemas.openxmlformats.org/drawingml/2006/picture">
-            <wp:extent cx="5040000" cy="1189125"/>
+            <wp:extent cx="5040000" cy="4200000"/>
             <wp:docPr id="3" name="Picture 3"/>
             <wp:cNvGraphicFramePr>
               <a:graphicFrameLocks noChangeAspect="1"/>
@@ -1942,7 +1942,7 @@
                   <pic:spPr>
                     <a:xfrm>
                       <a:off x="0" y="0"/>
-                      <a:ext cx="5040000" cy="1189125"/>
+                      <a:ext cx="5040000" cy="4200000"/>
                     </a:xfrm>
                     <a:prstGeom prst="rect"/>
                   </pic:spPr>
@@ -2296,7 +2296,7 @@
       <w:r>
         <w:drawing>
           <wp:inline xmlns:a="http://schemas.openxmlformats.org/drawingml/2006/main" xmlns:pic="http://schemas.openxmlformats.org/drawingml/2006/picture">
-            <wp:extent cx="5040000" cy="3150000"/>
+            <wp:extent cx="5040000" cy="1545600"/>
             <wp:docPr id="4" name="Picture 4"/>
             <wp:cNvGraphicFramePr>
               <a:graphicFrameLocks noChangeAspect="1"/>
@@ -2317,7 +2317,7 @@
                   <pic:spPr>
                     <a:xfrm>
                       <a:off x="0" y="0"/>
-                      <a:ext cx="5040000" cy="3150000"/>
+                      <a:ext cx="5040000" cy="1545600"/>
                     </a:xfrm>
                     <a:prstGeom prst="rect"/>
                   </pic:spPr>
@@ -2473,7 +2473,7 @@
       <w:r>
         <w:drawing>
           <wp:inline xmlns:a="http://schemas.openxmlformats.org/drawingml/2006/main" xmlns:pic="http://schemas.openxmlformats.org/drawingml/2006/picture">
-            <wp:extent cx="5040000" cy="3150000"/>
+            <wp:extent cx="5040000" cy="3063273"/>
             <wp:docPr id="5" name="Picture 5"/>
             <wp:cNvGraphicFramePr>
               <a:graphicFrameLocks noChangeAspect="1"/>
@@ -2494,7 +2494,7 @@
                   <pic:spPr>
                     <a:xfrm>
                       <a:off x="0" y="0"/>
-                      <a:ext cx="5040000" cy="3150000"/>
+                      <a:ext cx="5040000" cy="3063273"/>
                     </a:xfrm>
                     <a:prstGeom prst="rect"/>
                   </pic:spPr>
@@ -4114,7 +4114,7 @@
       <w:r>
         <w:drawing>
           <wp:inline xmlns:a="http://schemas.openxmlformats.org/drawingml/2006/main" xmlns:pic="http://schemas.openxmlformats.org/drawingml/2006/picture">
-            <wp:extent cx="5040000" cy="1338750"/>
+            <wp:extent cx="5040000" cy="3225600"/>
             <wp:docPr id="6" name="Picture 6"/>
             <wp:cNvGraphicFramePr>
               <a:graphicFrameLocks noChangeAspect="1"/>
@@ -4135,7 +4135,7 @@
                   <pic:spPr>
                     <a:xfrm>
                       <a:off x="0" y="0"/>
-                      <a:ext cx="5040000" cy="1338750"/>
+                      <a:ext cx="5040000" cy="3225600"/>
                     </a:xfrm>
                     <a:prstGeom prst="rect"/>
                   </pic:spPr>
@@ -5701,7 +5701,7 @@
       <w:r>
         <w:drawing>
           <wp:inline xmlns:a="http://schemas.openxmlformats.org/drawingml/2006/main" xmlns:pic="http://schemas.openxmlformats.org/drawingml/2006/picture">
-            <wp:extent cx="5040000" cy="3150000"/>
+            <wp:extent cx="5040000" cy="3559270"/>
             <wp:docPr id="7" name="Picture 7"/>
             <wp:cNvGraphicFramePr>
               <a:graphicFrameLocks noChangeAspect="1"/>
@@ -5722,7 +5722,7 @@
                   <pic:spPr>
                     <a:xfrm>
                       <a:off x="0" y="0"/>
-                      <a:ext cx="5040000" cy="3150000"/>
+                      <a:ext cx="5040000" cy="3559270"/>
                     </a:xfrm>
                     <a:prstGeom prst="rect"/>
                   </pic:spPr>
@@ -6137,7 +6137,7 @@
       <w:r>
         <w:drawing>
           <wp:inline xmlns:a="http://schemas.openxmlformats.org/drawingml/2006/main" xmlns:pic="http://schemas.openxmlformats.org/drawingml/2006/picture">
-            <wp:extent cx="5040000" cy="5591765"/>
+            <wp:extent cx="5040000" cy="2240000"/>
             <wp:docPr id="8" name="Picture 8"/>
             <wp:cNvGraphicFramePr>
               <a:graphicFrameLocks noChangeAspect="1"/>
@@ -6158,7 +6158,7 @@
                   <pic:spPr>
                     <a:xfrm>
                       <a:off x="0" y="0"/>
-                      <a:ext cx="5040000" cy="5591765"/>
+                      <a:ext cx="5040000" cy="2240000"/>
                     </a:xfrm>
                     <a:prstGeom prst="rect"/>
                   </pic:spPr>
@@ -6386,7 +6386,7 @@
       <w:r>
         <w:drawing>
           <wp:inline xmlns:a="http://schemas.openxmlformats.org/drawingml/2006/main" xmlns:pic="http://schemas.openxmlformats.org/drawingml/2006/picture">
-            <wp:extent cx="5040000" cy="2298343"/>
+            <wp:extent cx="5040000" cy="1680000"/>
             <wp:docPr id="9" name="Picture 9"/>
             <wp:cNvGraphicFramePr>
               <a:graphicFrameLocks noChangeAspect="1"/>
@@ -6407,7 +6407,7 @@
                   <pic:spPr>
                     <a:xfrm>
                       <a:off x="0" y="0"/>
-                      <a:ext cx="5040000" cy="2298343"/>
+                      <a:ext cx="5040000" cy="1680000"/>
                     </a:xfrm>
                     <a:prstGeom prst="rect"/>
                   </pic:spPr>
@@ -7624,7 +7624,7 @@
       <w:r>
         <w:drawing>
           <wp:inline xmlns:a="http://schemas.openxmlformats.org/drawingml/2006/main" xmlns:pic="http://schemas.openxmlformats.org/drawingml/2006/picture">
-            <wp:extent cx="5040000" cy="522375"/>
+            <wp:extent cx="5040000" cy="102535"/>
             <wp:docPr id="10" name="Picture 10"/>
             <wp:cNvGraphicFramePr>
               <a:graphicFrameLocks noChangeAspect="1"/>
@@ -7645,7 +7645,7 @@
                   <pic:spPr>
                     <a:xfrm>
                       <a:off x="0" y="0"/>
-                      <a:ext cx="5040000" cy="522375"/>
+                      <a:ext cx="5040000" cy="102535"/>
                     </a:xfrm>
                     <a:prstGeom prst="rect"/>
                   </pic:spPr>
@@ -9990,6 +9990,62 @@
     </w:p>
     <w:p>
       <w:pPr>
+        <w:spacing w:before="160" w:after="80"/>
+        <w:jc w:val="center"/>
+        <w:keepNext w:val="1"/>
+      </w:pPr>
+      <w:r>
+        <w:drawing>
+          <wp:inline xmlns:a="http://schemas.openxmlformats.org/drawingml/2006/main" xmlns:pic="http://schemas.openxmlformats.org/drawingml/2006/picture">
+            <wp:extent cx="5040000" cy="3192000"/>
+            <wp:docPr id="11" name="Picture 11"/>
+            <wp:cNvGraphicFramePr>
+              <a:graphicFrameLocks noChangeAspect="1"/>
+            </wp:cNvGraphicFramePr>
+            <a:graphic>
+              <a:graphicData uri="http://schemas.openxmlformats.org/drawingml/2006/picture">
+                <pic:pic>
+                  <pic:nvPicPr>
+                    <pic:cNvPr id="0" name="config_info_dialog.png"/>
+                    <pic:cNvPicPr/>
+                  </pic:nvPicPr>
+                  <pic:blipFill>
+                    <a:blip r:embed="rId26"/>
+                    <a:stretch>
+                      <a:fillRect/>
+                    </a:stretch>
+                  </pic:blipFill>
+                  <pic:spPr>
+                    <a:xfrm>
+                      <a:off x="0" y="0"/>
+                      <a:ext cx="5040000" cy="3192000"/>
+                    </a:xfrm>
+                    <a:prstGeom prst="rect"/>
+                  </pic:spPr>
+                </pic:pic>
+              </a:graphicData>
+            </a:graphic>
+          </wp:inline>
+        </w:drawing>
+      </w:r>
+    </w:p>
+    <w:p>
+      <w:pPr>
+        <w:spacing w:before="40" w:after="240"/>
+        <w:jc w:val="center"/>
+      </w:pPr>
+      <w:r>
+        <w:rPr>
+          <w:rFonts w:ascii="PT Sans" w:hAnsi="PT Sans"/>
+          <w:i/>
+          <w:color w:val="7F8C8D"/>
+          <w:sz w:val="19"/>
+        </w:rPr>
+        <w:t>Figure: Config Info Dialog Interface with RX and TX Layout Tabs</w:t>
+      </w:r>
+    </w:p>
+    <w:p>
+      <w:pPr>
         <w:spacing w:after="60" w:before="20"/>
         <w:ind w:left="640" w:hanging="280"/>
         <w:jc w:val="left"/>
@@ -11921,6 +11977,62 @@
     </w:p>
     <w:p>
       <w:pPr>
+        <w:spacing w:before="160" w:after="80"/>
+        <w:jc w:val="center"/>
+        <w:keepNext w:val="1"/>
+      </w:pPr>
+      <w:r>
+        <w:drawing>
+          <wp:inline xmlns:a="http://schemas.openxmlformats.org/drawingml/2006/main" xmlns:pic="http://schemas.openxmlformats.org/drawingml/2006/picture">
+            <wp:extent cx="5040000" cy="5427692"/>
+            <wp:docPr id="12" name="Picture 12"/>
+            <wp:cNvGraphicFramePr>
+              <a:graphicFrameLocks noChangeAspect="1"/>
+            </wp:cNvGraphicFramePr>
+            <a:graphic>
+              <a:graphicData uri="http://schemas.openxmlformats.org/drawingml/2006/picture">
+                <pic:pic>
+                  <pic:nvPicPr>
+                    <pic:cNvPr id="0" name="tx_commands_panel.png"/>
+                    <pic:cNvPicPr/>
+                  </pic:nvPicPr>
+                  <pic:blipFill>
+                    <a:blip r:embed="rId27"/>
+                    <a:stretch>
+                      <a:fillRect/>
+                    </a:stretch>
+                  </pic:blipFill>
+                  <pic:spPr>
+                    <a:xfrm>
+                      <a:off x="0" y="0"/>
+                      <a:ext cx="5040000" cy="5427692"/>
+                    </a:xfrm>
+                    <a:prstGeom prst="rect"/>
+                  </pic:spPr>
+                </pic:pic>
+              </a:graphicData>
+            </a:graphic>
+          </wp:inline>
+        </w:drawing>
+      </w:r>
+    </w:p>
+    <w:p>
+      <w:pPr>
+        <w:spacing w:before="40" w:after="240"/>
+        <w:jc w:val="center"/>
+      </w:pPr>
+      <w:r>
+        <w:rPr>
+          <w:rFonts w:ascii="PT Sans" w:hAnsi="PT Sans"/>
+          <w:i/>
+          <w:color w:val="7F8C8D"/>
+          <w:sz w:val="19"/>
+        </w:rPr>
+        <w:t>Figure: TX Commands Panel User Interface with Parameter Inputs and Hex Packet Preview</w:t>
+      </w:r>
+    </w:p>
+    <w:p>
+      <w:pPr>
         <w:pStyle w:val="Heading2"/>
         <w:spacing w:before="240" w:after="100"/>
       </w:pPr>
@@ -12218,6 +12330,62 @@
       <w:pPr>
         <w:spacing w:after="40"/>
       </w:pPr>
+    </w:p>
+    <w:p>
+      <w:pPr>
+        <w:spacing w:before="160" w:after="80"/>
+        <w:jc w:val="center"/>
+        <w:keepNext w:val="1"/>
+      </w:pPr>
+      <w:r>
+        <w:drawing>
+          <wp:inline xmlns:a="http://schemas.openxmlformats.org/drawingml/2006/main" xmlns:pic="http://schemas.openxmlformats.org/drawingml/2006/picture">
+            <wp:extent cx="5040000" cy="3360000"/>
+            <wp:docPr id="13" name="Picture 13"/>
+            <wp:cNvGraphicFramePr>
+              <a:graphicFrameLocks noChangeAspect="1"/>
+            </wp:cNvGraphicFramePr>
+            <a:graphic>
+              <a:graphicData uri="http://schemas.openxmlformats.org/drawingml/2006/picture">
+                <pic:pic>
+                  <pic:nvPicPr>
+                    <pic:cNvPr id="0" name="parameter_editor_panel.png"/>
+                    <pic:cNvPicPr/>
+                  </pic:nvPicPr>
+                  <pic:blipFill>
+                    <a:blip r:embed="rId28"/>
+                    <a:stretch>
+                      <a:fillRect/>
+                    </a:stretch>
+                  </pic:blipFill>
+                  <pic:spPr>
+                    <a:xfrm>
+                      <a:off x="0" y="0"/>
+                      <a:ext cx="5040000" cy="3360000"/>
+                    </a:xfrm>
+                    <a:prstGeom prst="rect"/>
+                  </pic:spPr>
+                </pic:pic>
+              </a:graphicData>
+            </a:graphic>
+          </wp:inline>
+        </w:drawing>
+      </w:r>
+    </w:p>
+    <w:p>
+      <w:pPr>
+        <w:spacing w:before="40" w:after="240"/>
+        <w:jc w:val="center"/>
+      </w:pPr>
+      <w:r>
+        <w:rPr>
+          <w:rFonts w:ascii="PT Sans" w:hAnsi="PT Sans"/>
+          <w:i/>
+          <w:color w:val="7F8C8D"/>
+          <w:sz w:val="19"/>
+        </w:rPr>
+        <w:t>Figure: Parameter Editor Panel with Live Values and Editable Fields</w:t>
+      </w:r>
     </w:p>
     <w:p>
       <w:pPr>
@@ -15319,6 +15487,62 @@
         <w:spacing w:after="40"/>
       </w:pPr>
     </w:p>
+    <w:p>
+      <w:pPr>
+        <w:spacing w:before="160" w:after="80"/>
+        <w:jc w:val="center"/>
+        <w:keepNext w:val="1"/>
+      </w:pPr>
+      <w:r>
+        <w:drawing>
+          <wp:inline xmlns:a="http://schemas.openxmlformats.org/drawingml/2006/main" xmlns:pic="http://schemas.openxmlformats.org/drawingml/2006/picture">
+            <wp:extent cx="5040000" cy="2394000"/>
+            <wp:docPr id="14" name="Picture 14"/>
+            <wp:cNvGraphicFramePr>
+              <a:graphicFrameLocks noChangeAspect="1"/>
+            </wp:cNvGraphicFramePr>
+            <a:graphic>
+              <a:graphicData uri="http://schemas.openxmlformats.org/drawingml/2006/picture">
+                <pic:pic>
+                  <pic:nvPicPr>
+                    <pic:cNvPr id="0" name="logging_dialog.png"/>
+                    <pic:cNvPicPr/>
+                  </pic:nvPicPr>
+                  <pic:blipFill>
+                    <a:blip r:embed="rId29"/>
+                    <a:stretch>
+                      <a:fillRect/>
+                    </a:stretch>
+                  </pic:blipFill>
+                  <pic:spPr>
+                    <a:xfrm>
+                      <a:off x="0" y="0"/>
+                      <a:ext cx="5040000" cy="2394000"/>
+                    </a:xfrm>
+                    <a:prstGeom prst="rect"/>
+                  </pic:spPr>
+                </pic:pic>
+              </a:graphicData>
+            </a:graphic>
+          </wp:inline>
+        </w:drawing>
+      </w:r>
+    </w:p>
+    <w:p>
+      <w:pPr>
+        <w:spacing w:before="40" w:after="240"/>
+        <w:jc w:val="center"/>
+      </w:pPr>
+      <w:r>
+        <w:rPr>
+          <w:rFonts w:ascii="PT Sans" w:hAnsi="PT Sans"/>
+          <w:i/>
+          <w:color w:val="7F8C8D"/>
+          <w:sz w:val="19"/>
+        </w:rPr>
+        <w:t>Figure: Start Logging Session Configuration Dialog</w:t>
+      </w:r>
+    </w:p>
     <w:tbl>
       <w:tblPr>
         <w:tblW w:type="auto" w:w="0"/>
@@ -15727,6 +15951,62 @@
     </w:p>
     <w:p>
       <w:pPr>
+        <w:spacing w:before="160" w:after="80"/>
+        <w:jc w:val="center"/>
+        <w:keepNext w:val="1"/>
+      </w:pPr>
+      <w:r>
+        <w:drawing>
+          <wp:inline xmlns:a="http://schemas.openxmlformats.org/drawingml/2006/main" xmlns:pic="http://schemas.openxmlformats.org/drawingml/2006/picture">
+            <wp:extent cx="5040000" cy="3207273"/>
+            <wp:docPr id="15" name="Picture 15"/>
+            <wp:cNvGraphicFramePr>
+              <a:graphicFrameLocks noChangeAspect="1"/>
+            </wp:cNvGraphicFramePr>
+            <a:graphic>
+              <a:graphicData uri="http://schemas.openxmlformats.org/drawingml/2006/picture">
+                <pic:pic>
+                  <pic:nvPicPr>
+                    <pic:cNvPr id="0" name="analysis_suite.png"/>
+                    <pic:cNvPicPr/>
+                  </pic:nvPicPr>
+                  <pic:blipFill>
+                    <a:blip r:embed="rId30"/>
+                    <a:stretch>
+                      <a:fillRect/>
+                    </a:stretch>
+                  </pic:blipFill>
+                  <pic:spPr>
+                    <a:xfrm>
+                      <a:off x="0" y="0"/>
+                      <a:ext cx="5040000" cy="3207273"/>
+                    </a:xfrm>
+                    <a:prstGeom prst="rect"/>
+                  </pic:spPr>
+                </pic:pic>
+              </a:graphicData>
+            </a:graphic>
+          </wp:inline>
+        </w:drawing>
+      </w:r>
+    </w:p>
+    <w:p>
+      <w:pPr>
+        <w:spacing w:before="40" w:after="240"/>
+        <w:jc w:val="center"/>
+      </w:pPr>
+      <w:r>
+        <w:rPr>
+          <w:rFonts w:ascii="PT Sans" w:hAnsi="PT Sans"/>
+          <w:i/>
+          <w:color w:val="7F8C8D"/>
+          <w:sz w:val="19"/>
+        </w:rPr>
+        <w:t>Figure: Offline Log Analysis Suite Interface</w:t>
+      </w:r>
+    </w:p>
+    <w:p>
+      <w:pPr>
         <w:pStyle w:val="Heading3"/>
         <w:spacing w:before="160" w:after="60"/>
       </w:pPr>
@@ -18302,6 +18582,62 @@
     </w:p>
     <w:p>
       <w:pPr>
+        <w:spacing w:before="160" w:after="80"/>
+        <w:jc w:val="center"/>
+        <w:keepNext w:val="1"/>
+      </w:pPr>
+      <w:r>
+        <w:drawing>
+          <wp:inline xmlns:a="http://schemas.openxmlformats.org/drawingml/2006/main" xmlns:pic="http://schemas.openxmlformats.org/drawingml/2006/picture">
+            <wp:extent cx="5040000" cy="3120000"/>
+            <wp:docPr id="16" name="Picture 16"/>
+            <wp:cNvGraphicFramePr>
+              <a:graphicFrameLocks noChangeAspect="1"/>
+            </wp:cNvGraphicFramePr>
+            <a:graphic>
+              <a:graphicData uri="http://schemas.openxmlformats.org/drawingml/2006/picture">
+                <pic:pic>
+                  <pic:nvPicPr>
+                    <pic:cNvPr id="0" name="schema_mapper.png"/>
+                    <pic:cNvPicPr/>
+                  </pic:nvPicPr>
+                  <pic:blipFill>
+                    <a:blip r:embed="rId31"/>
+                    <a:stretch>
+                      <a:fillRect/>
+                    </a:stretch>
+                  </pic:blipFill>
+                  <pic:spPr>
+                    <a:xfrm>
+                      <a:off x="0" y="0"/>
+                      <a:ext cx="5040000" cy="3120000"/>
+                    </a:xfrm>
+                    <a:prstGeom prst="rect"/>
+                  </pic:spPr>
+                </pic:pic>
+              </a:graphicData>
+            </a:graphic>
+          </wp:inline>
+        </w:drawing>
+      </w:r>
+    </w:p>
+    <w:p>
+      <w:pPr>
+        <w:spacing w:before="40" w:after="240"/>
+        <w:jc w:val="center"/>
+      </w:pPr>
+      <w:r>
+        <w:rPr>
+          <w:rFonts w:ascii="PT Sans" w:hAnsi="PT Sans"/>
+          <w:i/>
+          <w:color w:val="7F8C8D"/>
+          <w:sz w:val="19"/>
+        </w:rPr>
+        <w:t>Figure: Import Schema Mapper Dialog</w:t>
+      </w:r>
+    </w:p>
+    <w:p>
+      <w:pPr>
         <w:spacing w:after="120" w:before="40"/>
         <w:jc w:val="left"/>
       </w:pPr>
@@ -18354,6 +18690,62 @@
       <w:pPr>
         <w:spacing w:after="40"/>
       </w:pPr>
+    </w:p>
+    <w:p>
+      <w:pPr>
+        <w:spacing w:before="160" w:after="80"/>
+        <w:jc w:val="center"/>
+        <w:keepNext w:val="1"/>
+      </w:pPr>
+      <w:r>
+        <w:drawing>
+          <wp:inline xmlns:a="http://schemas.openxmlformats.org/drawingml/2006/main" xmlns:pic="http://schemas.openxmlformats.org/drawingml/2006/picture">
+            <wp:extent cx="5040000" cy="3600000"/>
+            <wp:docPr id="17" name="Picture 17"/>
+            <wp:cNvGraphicFramePr>
+              <a:graphicFrameLocks noChangeAspect="1"/>
+            </wp:cNvGraphicFramePr>
+            <a:graphic>
+              <a:graphicData uri="http://schemas.openxmlformats.org/drawingml/2006/picture">
+                <pic:pic>
+                  <pic:nvPicPr>
+                    <pic:cNvPr id="0" name="xy_plotter.png"/>
+                    <pic:cNvPicPr/>
+                  </pic:nvPicPr>
+                  <pic:blipFill>
+                    <a:blip r:embed="rId32"/>
+                    <a:stretch>
+                      <a:fillRect/>
+                    </a:stretch>
+                  </pic:blipFill>
+                  <pic:spPr>
+                    <a:xfrm>
+                      <a:off x="0" y="0"/>
+                      <a:ext cx="5040000" cy="3600000"/>
+                    </a:xfrm>
+                    <a:prstGeom prst="rect"/>
+                  </pic:spPr>
+                </pic:pic>
+              </a:graphicData>
+            </a:graphic>
+          </wp:inline>
+        </w:drawing>
+      </w:r>
+    </w:p>
+    <w:p>
+      <w:pPr>
+        <w:spacing w:before="40" w:after="240"/>
+        <w:jc w:val="center"/>
+      </w:pPr>
+      <w:r>
+        <w:rPr>
+          <w:rFonts w:ascii="PT Sans" w:hAnsi="PT Sans"/>
+          <w:i/>
+          <w:color w:val="7F8C8D"/>
+          <w:sz w:val="19"/>
+        </w:rPr>
+        <w:t>Figure: Scatter X-Y Plotter Window with Linear Regression</w:t>
+      </w:r>
     </w:p>
     <w:tbl>
       <w:tblPr>

</xml_diff>

<commit_message>
docs: add Bytehound user manual document
</commit_message>
<xml_diff>
--- a/Documentation/Bytehound_User_Manual.docx
+++ b/Documentation/Bytehound_User_Manual.docx
@@ -15695,6 +15695,434 @@
     <w:p>
       <w:pPr>
         <w:spacing w:after="80"/>
+      </w:pPr>
+    </w:p>
+    <w:p>
+      <w:pPr>
+        <w:pStyle w:val="Heading3"/>
+        <w:spacing w:before="160" w:after="60"/>
+      </w:pPr>
+      <w:r>
+        <w:rPr>
+          <w:rFonts w:ascii="PT Sans" w:hAnsi="PT Sans"/>
+          <w:b/>
+          <w:i w:val="0"/>
+          <w:color w:val="1A5F7A"/>
+          <w:sz w:val="24"/>
+        </w:rPr>
+        <w:t>Decoded Log Cycle Buffer &amp; Synchronization</w:t>
+      </w:r>
+    </w:p>
+    <w:p>
+      <w:pPr>
+        <w:spacing w:after="120" w:before="40"/>
+        <w:jc w:val="left"/>
+      </w:pPr>
+      <w:r>
+        <w:rPr>
+          <w:rFonts w:ascii="PT Sans" w:hAnsi="PT Sans"/>
+          <w:b w:val="0"/>
+          <w:i w:val="0"/>
+          <w:sz w:val="22"/>
+        </w:rPr>
+        <w:t>The decoded Excel workbook (</w:t>
+      </w:r>
+      <w:r>
+        <w:rPr>
+          <w:rFonts w:ascii="Consolas" w:hAnsi="Consolas"/>
+          <w:b w:val="0"/>
+          <w:i w:val="0"/>
+          <w:color w:val="1A5F7A"/>
+          <w:sz w:val="20"/>
+        </w:rPr>
+        <w:t>*_decoded.xlsx</w:t>
+      </w:r>
+      <w:r>
+        <w:rPr>
+          <w:rFonts w:ascii="PT Sans" w:hAnsi="PT Sans"/>
+          <w:b w:val="0"/>
+          <w:i w:val="0"/>
+          <w:sz w:val="22"/>
+        </w:rPr>
+        <w:t xml:space="preserve">) stores telemetry in a wide format, where each row represents a complete cycle of all active frames. Individual frames arrive asynchronously and are stashed in an in-memory cycle buffer. When the </w:t>
+      </w:r>
+      <w:r>
+        <w:rPr>
+          <w:rFonts w:ascii="PT Sans" w:hAnsi="PT Sans"/>
+          <w:b/>
+          <w:i w:val="0"/>
+          <w:sz w:val="22"/>
+        </w:rPr>
+        <w:t>trigger frame</w:t>
+      </w:r>
+      <w:r>
+        <w:rPr>
+          <w:rFonts w:ascii="PT Sans" w:hAnsi="PT Sans"/>
+          <w:b w:val="0"/>
+          <w:i w:val="0"/>
+          <w:sz w:val="22"/>
+        </w:rPr>
+        <w:t xml:space="preserve"> (the last RX-capable frame declared in the configuration) is received:</w:t>
+      </w:r>
+    </w:p>
+    <w:p>
+      <w:pPr>
+        <w:spacing w:after="60" w:before="20"/>
+        <w:ind w:left="640" w:hanging="280"/>
+        <w:jc w:val="left"/>
+      </w:pPr>
+      <w:r>
+        <w:rPr>
+          <w:rFonts w:ascii="PT Sans" w:hAnsi="PT Sans"/>
+          <w:b/>
+          <w:i w:val="0"/>
+          <w:color w:val="3498DB"/>
+          <w:sz w:val="22"/>
+        </w:rPr>
+        <w:t xml:space="preserve">•  </w:t>
+      </w:r>
+      <w:r>
+        <w:rPr>
+          <w:rFonts w:ascii="PT Sans" w:hAnsi="PT Sans"/>
+          <w:b w:val="0"/>
+          <w:i w:val="0"/>
+          <w:sz w:val="22"/>
+        </w:rPr>
+        <w:t>Bytehound checks if all required frames for the cycle have been received.</w:t>
+      </w:r>
+    </w:p>
+    <w:p>
+      <w:pPr>
+        <w:spacing w:after="60" w:before="20"/>
+        <w:ind w:left="640" w:hanging="280"/>
+        <w:jc w:val="left"/>
+      </w:pPr>
+      <w:r>
+        <w:rPr>
+          <w:rFonts w:ascii="PT Sans" w:hAnsi="PT Sans"/>
+          <w:b/>
+          <w:i w:val="0"/>
+          <w:color w:val="3498DB"/>
+          <w:sz w:val="22"/>
+        </w:rPr>
+        <w:t xml:space="preserve">•  </w:t>
+      </w:r>
+      <w:r>
+        <w:rPr>
+          <w:rFonts w:ascii="PT Sans" w:hAnsi="PT Sans"/>
+          <w:b w:val="0"/>
+          <w:i w:val="0"/>
+          <w:sz w:val="22"/>
+        </w:rPr>
+        <w:t xml:space="preserve">If the cycle is complete, a wide row is appended to the </w:t>
+      </w:r>
+      <w:r>
+        <w:rPr>
+          <w:rFonts w:ascii="Consolas" w:hAnsi="Consolas"/>
+          <w:b w:val="0"/>
+          <w:i w:val="0"/>
+          <w:color w:val="1A5F7A"/>
+          <w:sz w:val="20"/>
+        </w:rPr>
+        <w:t>Data</w:t>
+      </w:r>
+      <w:r>
+        <w:rPr>
+          <w:rFonts w:ascii="PT Sans" w:hAnsi="PT Sans"/>
+          <w:b w:val="0"/>
+          <w:i w:val="0"/>
+          <w:sz w:val="22"/>
+        </w:rPr>
+        <w:t xml:space="preserve"> sheet containing timestamps and signal values for all frames.</w:t>
+      </w:r>
+    </w:p>
+    <w:p>
+      <w:pPr>
+        <w:spacing w:after="60" w:before="20"/>
+        <w:ind w:left="640" w:hanging="280"/>
+        <w:jc w:val="left"/>
+      </w:pPr>
+      <w:r>
+        <w:rPr>
+          <w:rFonts w:ascii="PT Sans" w:hAnsi="PT Sans"/>
+          <w:b/>
+          <w:i w:val="0"/>
+          <w:color w:val="3498DB"/>
+          <w:sz w:val="22"/>
+        </w:rPr>
+        <w:t xml:space="preserve">•  </w:t>
+      </w:r>
+      <w:r>
+        <w:rPr>
+          <w:rFonts w:ascii="PT Sans" w:hAnsi="PT Sans"/>
+          <w:b w:val="0"/>
+          <w:i w:val="0"/>
+          <w:sz w:val="22"/>
+        </w:rPr>
+        <w:t>The cycle buffer is cleared upon trigger arrival to prevent carrying stale values forward to the next cycle.</w:t>
+      </w:r>
+    </w:p>
+    <w:p>
+      <w:pPr>
+        <w:spacing w:after="40"/>
+      </w:pPr>
+    </w:p>
+    <w:p>
+      <w:pPr>
+        <w:pStyle w:val="Heading3"/>
+        <w:spacing w:before="160" w:after="60"/>
+      </w:pPr>
+      <w:r>
+        <w:rPr>
+          <w:rFonts w:ascii="PT Sans" w:hAnsi="PT Sans"/>
+          <w:b/>
+          <w:i w:val="0"/>
+          <w:color w:val="1A5F7A"/>
+          <w:sz w:val="24"/>
+        </w:rPr>
+        <w:t>Decoded Logger Unblocking for Mixed RX/TX Profiles</w:t>
+      </w:r>
+    </w:p>
+    <w:p>
+      <w:pPr>
+        <w:spacing w:after="120" w:before="40"/>
+        <w:jc w:val="left"/>
+      </w:pPr>
+      <w:r>
+        <w:rPr>
+          <w:rFonts w:ascii="PT Sans" w:hAnsi="PT Sans"/>
+          <w:b w:val="0"/>
+          <w:i w:val="0"/>
+          <w:sz w:val="22"/>
+        </w:rPr>
+        <w:t xml:space="preserve">In telemetry configurations containing both incoming receive (RX) frames and outgoing transmit (TX) commands, requiring all frames to complete a cycle would cause logging to stall indefinitely (as commands are only sent on-demand). To prevent this, Bytehound implements </w:t>
+      </w:r>
+      <w:r>
+        <w:rPr>
+          <w:rFonts w:ascii="PT Sans" w:hAnsi="PT Sans"/>
+          <w:b/>
+          <w:i w:val="0"/>
+          <w:sz w:val="22"/>
+        </w:rPr>
+        <w:t>Decoded Logger Unblocking</w:t>
+      </w:r>
+      <w:r>
+        <w:rPr>
+          <w:rFonts w:ascii="PT Sans" w:hAnsi="PT Sans"/>
+          <w:b w:val="0"/>
+          <w:i w:val="0"/>
+          <w:sz w:val="22"/>
+        </w:rPr>
+        <w:t>:</w:t>
+      </w:r>
+    </w:p>
+    <w:p>
+      <w:pPr>
+        <w:spacing w:after="60" w:before="20"/>
+        <w:ind w:left="640" w:hanging="280"/>
+        <w:jc w:val="left"/>
+      </w:pPr>
+      <w:r>
+        <w:rPr>
+          <w:rFonts w:ascii="PT Sans" w:hAnsi="PT Sans"/>
+          <w:b/>
+          <w:i w:val="0"/>
+          <w:color w:val="3498DB"/>
+          <w:sz w:val="22"/>
+        </w:rPr>
+        <w:t xml:space="preserve">•  </w:t>
+      </w:r>
+      <w:r>
+        <w:rPr>
+          <w:rFonts w:ascii="PT Sans" w:hAnsi="PT Sans"/>
+          <w:b w:val="0"/>
+          <w:i w:val="0"/>
+          <w:sz w:val="22"/>
+        </w:rPr>
+        <w:t xml:space="preserve">Transmit-only frames (those marked with </w:t>
+      </w:r>
+      <w:r>
+        <w:rPr>
+          <w:rFonts w:ascii="Consolas" w:hAnsi="Consolas"/>
+          <w:b w:val="0"/>
+          <w:i w:val="0"/>
+          <w:color w:val="1A5F7A"/>
+          <w:sz w:val="20"/>
+        </w:rPr>
+        <w:t>direction = tx</w:t>
+      </w:r>
+      <w:r>
+        <w:rPr>
+          <w:rFonts w:ascii="PT Sans" w:hAnsi="PT Sans"/>
+          <w:b w:val="0"/>
+          <w:i w:val="0"/>
+          <w:sz w:val="22"/>
+        </w:rPr>
+        <w:t xml:space="preserve"> in the Frames sheet, or associated with TX commands) are dynamically excluded from the list of required cycle frames.</w:t>
+      </w:r>
+    </w:p>
+    <w:p>
+      <w:pPr>
+        <w:spacing w:after="60" w:before="20"/>
+        <w:ind w:left="640" w:hanging="280"/>
+        <w:jc w:val="left"/>
+      </w:pPr>
+      <w:r>
+        <w:rPr>
+          <w:rFonts w:ascii="PT Sans" w:hAnsi="PT Sans"/>
+          <w:b/>
+          <w:i w:val="0"/>
+          <w:color w:val="3498DB"/>
+          <w:sz w:val="22"/>
+        </w:rPr>
+        <w:t xml:space="preserve">•  </w:t>
+      </w:r>
+      <w:r>
+        <w:rPr>
+          <w:rFonts w:ascii="PT Sans" w:hAnsi="PT Sans"/>
+          <w:b w:val="0"/>
+          <w:i w:val="0"/>
+          <w:sz w:val="22"/>
+        </w:rPr>
+        <w:t>The cycle is driven entirely by incoming receive-capable telemetry frames, ensuring that logging proceeds smoothly without stalling.</w:t>
+      </w:r>
+    </w:p>
+    <w:p>
+      <w:pPr>
+        <w:spacing w:after="40"/>
+      </w:pPr>
+    </w:p>
+    <w:p>
+      <w:pPr>
+        <w:pStyle w:val="Heading3"/>
+        <w:spacing w:before="160" w:after="60"/>
+      </w:pPr>
+      <w:r>
+        <w:rPr>
+          <w:rFonts w:ascii="PT Sans" w:hAnsi="PT Sans"/>
+          <w:b/>
+          <w:i w:val="0"/>
+          <w:color w:val="1A5F7A"/>
+          <w:sz w:val="24"/>
+        </w:rPr>
+        <w:t>Transmitted (TX) Packet Decoding &amp; Logging</w:t>
+      </w:r>
+    </w:p>
+    <w:p>
+      <w:pPr>
+        <w:spacing w:after="120" w:before="40"/>
+        <w:jc w:val="left"/>
+      </w:pPr>
+      <w:r>
+        <w:rPr>
+          <w:rFonts w:ascii="PT Sans" w:hAnsi="PT Sans"/>
+          <w:b w:val="0"/>
+          <w:i w:val="0"/>
+          <w:sz w:val="22"/>
+        </w:rPr>
+        <w:t>To ensure that outbound controls and parameter modifications are fully captured, Bytehound hooks into raw wire transmissions to log outbound packets in the decoded stream on the fly:</w:t>
+      </w:r>
+    </w:p>
+    <w:p>
+      <w:pPr>
+        <w:spacing w:after="60" w:before="20"/>
+        <w:ind w:left="640" w:hanging="280"/>
+        <w:jc w:val="left"/>
+      </w:pPr>
+      <w:r>
+        <w:rPr>
+          <w:rFonts w:ascii="PT Sans" w:hAnsi="PT Sans"/>
+          <w:b/>
+          <w:i w:val="0"/>
+          <w:color w:val="3498DB"/>
+          <w:sz w:val="22"/>
+        </w:rPr>
+        <w:t xml:space="preserve">•  </w:t>
+      </w:r>
+      <w:r>
+        <w:rPr>
+          <w:rFonts w:ascii="PT Sans" w:hAnsi="PT Sans"/>
+          <w:b w:val="0"/>
+          <w:i w:val="0"/>
+          <w:sz w:val="22"/>
+        </w:rPr>
+        <w:t>Whenever a command packet is sent (via the TX Commands panel, the Parameter Editor, or Auto-Fetch polling), Bytehound intercepts the raw bytes, parses them, and decodes the signals.</w:t>
+      </w:r>
+    </w:p>
+    <w:p>
+      <w:pPr>
+        <w:spacing w:after="60" w:before="20"/>
+        <w:ind w:left="640" w:hanging="280"/>
+        <w:jc w:val="left"/>
+      </w:pPr>
+      <w:r>
+        <w:rPr>
+          <w:rFonts w:ascii="PT Sans" w:hAnsi="PT Sans"/>
+          <w:b/>
+          <w:i w:val="0"/>
+          <w:color w:val="3498DB"/>
+          <w:sz w:val="22"/>
+        </w:rPr>
+        <w:t xml:space="preserve">•  </w:t>
+      </w:r>
+      <w:r>
+        <w:rPr>
+          <w:rFonts w:ascii="PT Sans" w:hAnsi="PT Sans"/>
+          <w:b w:val="0"/>
+          <w:i w:val="0"/>
+          <w:sz w:val="22"/>
+        </w:rPr>
+        <w:t>These decoded TX values are stashed in the active cycle buffer.</w:t>
+      </w:r>
+    </w:p>
+    <w:p>
+      <w:pPr>
+        <w:spacing w:after="60" w:before="20"/>
+        <w:ind w:left="640" w:hanging="280"/>
+        <w:jc w:val="left"/>
+      </w:pPr>
+      <w:r>
+        <w:rPr>
+          <w:rFonts w:ascii="PT Sans" w:hAnsi="PT Sans"/>
+          <w:b/>
+          <w:i w:val="0"/>
+          <w:color w:val="3498DB"/>
+          <w:sz w:val="22"/>
+        </w:rPr>
+        <w:t xml:space="preserve">•  </w:t>
+      </w:r>
+      <w:r>
+        <w:rPr>
+          <w:rFonts w:ascii="PT Sans" w:hAnsi="PT Sans"/>
+          <w:b w:val="0"/>
+          <w:i w:val="0"/>
+          <w:sz w:val="22"/>
+        </w:rPr>
+        <w:t xml:space="preserve">When the next trigger frame arrives, these stashed TX values are committed to the </w:t>
+      </w:r>
+      <w:r>
+        <w:rPr>
+          <w:rFonts w:ascii="Consolas" w:hAnsi="Consolas"/>
+          <w:b w:val="0"/>
+          <w:i w:val="0"/>
+          <w:color w:val="1A5F7A"/>
+          <w:sz w:val="20"/>
+        </w:rPr>
+        <w:t>*_decoded.xlsx</w:t>
+      </w:r>
+      <w:r>
+        <w:rPr>
+          <w:rFonts w:ascii="PT Sans" w:hAnsi="PT Sans"/>
+          <w:b w:val="0"/>
+          <w:i w:val="0"/>
+          <w:sz w:val="22"/>
+        </w:rPr>
+        <w:t xml:space="preserve"> file along with the RX telemetry, creating a unified, chronological log of all input/output signals.</w:t>
+      </w:r>
+    </w:p>
+    <w:p>
+      <w:pPr>
+        <w:spacing w:after="40"/>
       </w:pPr>
     </w:p>
     <w:p>
@@ -43705,7 +44133,7 @@
         <w:color w:val="2C3E50"/>
         <w:sz w:val="18"/>
       </w:rPr>
-      <w:t xml:space="preserve">  /  Bytehound v0.4.5 — Serial Telemetry &amp; Decoder Guide</w:t>
+      <w:t xml:space="preserve">  /  Bytehound v1.0.0 — Serial Telemetry &amp; Decoder Guide</w:t>
     </w:r>
   </w:p>
 </w:ftr>

</xml_diff>